<commit_message>
docs(F15): resincronizar negocio.md y .docx con entrevista 3 real (Zavaleta)
</commit_message>
<xml_diff>
--- a/business/negocio.docx
+++ b/business/negocio.docx
@@ -2,7 +2,6 @@
 <file path=word/document.xml><?xml version="1.0" encoding="utf-8"?>
 <w:document xmlns:wpc="http://schemas.microsoft.com/office/word/2010/wordprocessingCanvas" xmlns:cx="http://schemas.microsoft.com/office/drawing/2014/chartex" xmlns:cx1="http://schemas.microsoft.com/office/drawing/2015/9/8/chartex" xmlns:cx2="http://schemas.microsoft.com/office/drawing/2015/10/21/chartex" xmlns:cx3="http://schemas.microsoft.com/office/drawing/2016/5/9/chartex" xmlns:cx4="http://schemas.microsoft.com/office/drawing/2016/5/10/chartex" xmlns:cx5="http://schemas.microsoft.com/office/drawing/2016/5/11/chartex" xmlns:cx6="http://schemas.microsoft.com/office/drawing/2016/5/12/chartex" xmlns:cx7="http://schemas.microsoft.com/office/drawing/2016/5/13/chartex" xmlns:cx8="http://schemas.microsoft.com/office/drawing/2016/5/14/chartex" xmlns:mc="http://schemas.openxmlformats.org/markup-compatibility/2006" xmlns:aink="http://schemas.microsoft.com/office/drawing/2016/ink" xmlns:am3d="http://schemas.microsoft.com/office/drawing/2017/model3d" xmlns:o="urn:schemas-microsoft-com:office:office" xmlns:oel="http://schemas.microsoft.com/office/2019/extlst" xmlns:r="http://schemas.openxmlformats.org/officeDocument/2006/relationships" xmlns:m="http://schemas.openxmlformats.org/officeDocument/2006/math" xmlns:v="urn:schemas-microsoft-com:vml" xmlns:wp14="http://schemas.microsoft.com/office/word/2010/wordprocessingDrawing" xmlns:wp="http://schemas.openxmlformats.org/drawingml/2006/wordprocessingDrawing" xmlns:w10="urn:schemas-microsoft-com:office:word" xmlns:w="http://schemas.openxmlformats.org/wordprocessingml/2006/main" xmlns:w14="http://schemas.microsoft.com/office/word/2010/wordml" xmlns:w15="http://schemas.microsoft.com/office/word/2012/wordml" xmlns:w16cex="http://schemas.microsoft.com/office/word/2018/wordml/cex" xmlns:w16cid="http://schemas.microsoft.com/office/word/2016/wordml/cid" xmlns:w16="http://schemas.microsoft.com/office/word/2018/wordml" xmlns:w16du="http://schemas.microsoft.com/office/word/2023/wordml/word16du" xmlns:w16sdtdh="http://schemas.microsoft.com/office/word/2020/wordml/sdtdatahash" xmlns:w16sdtfl="http://schemas.microsoft.com/office/word/2024/wordml/sdtformatlock" xmlns:w16se="http://schemas.microsoft.com/office/word/2015/wordml/symex" xmlns:wpg="http://schemas.microsoft.com/office/word/2010/wordprocessingGroup" xmlns:wpi="http://schemas.microsoft.com/office/word/2010/wordprocessingInk" xmlns:wne="http://schemas.microsoft.com/office/word/2006/wordml" xmlns:wps="http://schemas.microsoft.com/office/word/2010/wordprocessingShape" mc:Ignorable="w14 w15 w16se w16cid w16 w16cex w16sdtdh w16sdtfl w16du wp14">
   <w:body>
-    <w:p/>
     <w:p>
       <w:pPr>
         <w:spacing w:after="80"/>
@@ -1030,46 +1029,46 @@
           </w:p>
           <w:p>
             <w:r>
-              <w:t xml:space="preserve">  · Raúl — tech lead fintech sin DBA, 3 BDs ~120 GB principal: 15-20 h/mes.</w:t>
+              <w:t xml:space="preserve">  · Raúl — desarrollador fullstack con 100+ BDs en su carrera; 15-20 BDs activas, la mayor ~3 TB: 3-4 h/mes en producción estable y 16-20 h/mes en etapas tempranas (desarrollo, análisis, staging).</w:t>
             </w:r>
           </w:p>
           <w:p/>
           <w:p>
             <w:r>
-              <w:t>Conclusión clave: el dolor escala con la AUSENCIA DE DBA dedicado, no con el tamaño absoluto. Jos (1 GB) dedica 10× más tiempo que Carlos (30 GB con equipo). Raúl lo dijo literal: 'siento que la mitad de mi tiempo es de base de datos cuando debería estar haciendo otras cosas de tech lead'.</w:t>
+              <w:t>Conclusión clave: el dolor escala con la AUSENCIA DE DBA dedicado y con la FASE DEL CICLO DE VIDA, no con el tamaño absoluto. Jos (1 GB) dedica 10× más tiempo que Carlos (30 GB con equipo). Raúl confirma la dimensión "fase": pasa de 3-4 h/mes en producción estable a 16-20 h/mes en etapas tempranas, porque los queries existen aunque la BD aún no esté en producción.</w:t>
             </w:r>
           </w:p>
           <w:p/>
           <w:p>
             <w:r>
-              <w:t>Anti-patterns reportados — 3 de 3 mapean a detectores activos de PgPilot:</w:t>
-            </w:r>
-          </w:p>
-          <w:p>
-            <w:r>
-              <w:t xml:space="preserve">  · Carlos (F6): SELECT * sobre tablas con BLOBs → D9 (select_star).</w:t>
-            </w:r>
-          </w:p>
-          <w:p>
-            <w:r>
-              <w:t xml:space="preserve">  · Jos (F7): JOINs sin índices generando producto cartesiano → D16 (seq_scan_missing_index). Fix manual tomó 1 semana completa.</w:t>
-            </w:r>
-          </w:p>
-          <w:p>
-            <w:r>
-              <w:t xml:space="preserve">  · Raúl (F8): NOT IN sobre 2M registros bloqueó transacciones de pago en fintech → D19 (not_in_nullable_subquery). Fix con NOT EXISTS + índice parcial: 45 min → 3 seg. Costo: 4 h madrugada + 2 h postmortem.</w:t>
+              <w:t>Anti-patterns reportados — 2 de 3 mapean a detectores activos de PgPilot; 1 oportunidad de roadmap:</w:t>
+            </w:r>
+          </w:p>
+          <w:p>
+            <w:r>
+              <w:t xml:space="preserve">  · Carlos (F6): SELECT * sobre tablas con BLOBs → D9 (select_star). Detector activo.</w:t>
+            </w:r>
+          </w:p>
+          <w:p>
+            <w:r>
+              <w:t xml:space="preserve">  · Jos (F7): JOINs sin índices generando producto cartesiano → D16 (seq_scan_missing_index). Fix manual tomó 1 semana completa. Detector activo.</w:t>
+            </w:r>
+          </w:p>
+          <w:p>
+            <w:r>
+              <w:t xml:space="preserve">  · Raúl (F8): tabla de embarques de 300-400 GB en sistema logístico transnacional. Queries tardaban HORAS pese a tener índices. Solución manual: particionar físicamente la tabla + tablas temporales con COPY de Postgres para clonar embarques recientes (~300-400 MB). Funcionaba al 90% (fechas recientes); históricos de 5-7+ años seguían lentos. No es un detector activo hoy; queda como oportunidad de roadmap (detección proactiva de tablas crecientes sin estrategia de particionamiento — adyacente a D22 count_star_on_large_table que ya señala tablas grandes).</w:t>
             </w:r>
           </w:p>
           <w:p/>
           <w:p>
             <w:r>
-              <w:t>Severidad y costo mensual: $25-1,000 USD/equipo/mes en tiempo directo (Raúl: 15-20 h × $25-50/h = $500-1,000/mes; Carlos: $25-50/mes; Jos: $250-500/mes). Por incidente mayor con impacto a clientes: $500-5,000 USD adicionales (Gartner cost-of-downtime; el caso de Raúl con transacciones bloqueadas cae en la cota alta).</w:t>
+              <w:t>Severidad y costo mensual: $25-1,000 USD/equipo/mes en tiempo directo (Raúl: 16-20 h/mes en etapas tempranas × $25-50/h = $400-1,000/mes; Carlos: $25-50/mes; Jos: $250-500/mes). Por incidente mayor con impacto a operaciones: $500-5,000 USD adicionales (Gartner cost-of-downtime; el caso de Raúl con tabla de 300-400 GB en sistema logístico muestra el costo de no tener particionamiento proactivo).</w:t>
             </w:r>
           </w:p>
           <w:p/>
           <w:p>
             <w:r>
-              <w:t>ROI a $29/dev/mes (Pro): equipo de 5 devs = $145/mes; ahorra ≥2 h/mes diagnóstico + previene ≥1 incidente/trimestre → ROI positivo desde el mes 1. Caso Raúl: $200/mes vs $750-1,000/mes ahorradas = ROI 3-5× inmediato. Cita literal: '200 dólares contra lo que me pagan por esas horas es nada, yo la compraría sin pensarlo'.</w:t>
+              <w:t>ROI a $29/dev/mes (Pro): equipo de 5 devs = $145/mes; ahorra ≥2 h/mes diagnóstico + previene ≥1 incidente/trimestre → ROI positivo desde el mes 1. Caso Raúl: con 16-20 h/mes en etapas tempranas × $25-50/h = $400-1,000/mes en tiempo, una herramienta a $200/mes tiene ROI 2-5× inmediato. Sin embargo, Raúl cuestionó el modelo por BD con 15-20 BDs activas y sugirió explorar pricing por usuarios o por tiempo de ejecución — señal a incorporar al pricing Enterprise.</w:t>
             </w:r>
           </w:p>
         </w:tc>
@@ -1363,6 +1362,7 @@
           </w:tcPr>
           <w:p>
             <w:r>
+              <w:lastRenderedPageBreak/>
               <w:t>Jos Lugo — Ingeniero de software (fullstack)</w:t>
             </w:r>
           </w:p>
@@ -1460,7 +1460,7 @@
           </w:tcPr>
           <w:p>
             <w:r>
-              <w:t>Raúl de la Breña — Tech Lead Backend</w:t>
+              <w:t>Raúl Zavaleta — Desarrollador fullstack / Ingeniero de software</w:t>
             </w:r>
           </w:p>
         </w:tc>
@@ -1483,7 +1483,7 @@
           </w:tcPr>
           <w:p>
             <w:r>
-              <w:t>Fintech LATAM (3 BDs Postgres, principal ~120 GB con 45 tablas, sin DBA dedicado)</w:t>
+              <w:t>Empresa de software LATAM (15-20 BDs Postgres, la más grande ~3 TB, 100+ BDs en su carrera)</w:t>
             </w:r>
           </w:p>
         </w:tc>
@@ -1529,7 +1529,7 @@
           </w:tcPr>
           <w:p>
             <w:r>
-              <w:t>~12 min (videollamada grabada)</w:t>
+              <w:t>~10 min (videollamada grabada)</w:t>
             </w:r>
           </w:p>
         </w:tc>
@@ -1540,7 +1540,6 @@
         <w:pStyle w:val="Ttulo2"/>
       </w:pPr>
       <w:r>
-        <w:lastRenderedPageBreak/>
         <w:t>3.2 Preguntas hechas</w:t>
       </w:r>
     </w:p>
@@ -1650,61 +1649,62 @@
           <w:p/>
           <w:p>
             <w:r>
-              <w:t>1. Dolor reactivo, no proactivo. ✅ 3/3. Carlos: 'actuamos por eventos'; Jos: 1 semana de fix manual; Raúl: 15-20 h/mes pese a Grafana + Datadog (observabilidad ≠ optimización). Implicación: insertarnos en el momento de la alerta, no antes.</w:t>
+              <w:t>1. Dolor reactivo, no proactivo. ✅ 3/3. Carlos: "actuamos por eventos"; Jos: 1 semana de fix manual; Raúl: 16-20 h/mes en etapas tempranas con diagnóstico manual (DBeaver Enterprise + pg_stat_statements + EXPLAIN ANALYZE). Implicación: insertarnos en el momento de la alerta, no antes.</w:t>
             </w:r>
           </w:p>
           <w:p/>
           <w:p>
             <w:r>
-              <w:t>2. Anti-patterns reales → 3/3 mapean a detectores. ✅ Validado. D9 (Carlos), D16 (Jos), D19 (Raúl). Implicación: los 3 casos son demos del pitch; el de Raúl es el más fuerte (45 min → 3 seg + incidente fintech con pagos bloqueados).</w:t>
+              <w:t>2. Anti-patterns reales → 2/3 mapean a detectores activos + 1 oportunidad de roadmap. ✅ Parcial. D9 (Carlos), D16 (Jos); Raúl (tabla 300-400 GB sin particiones) no tiene detector hoy. Implicación: los casos de Carlos y Jos son demos directos del pitch; el de Raúl muestra la escala enterprise (queries que tardan horas por falta de particionamiento proactivo) y motiva el roadmap de un detector adyacente.</w:t>
             </w:r>
           </w:p>
           <w:p/>
           <w:p>
             <w:r>
-              <w:t>3. CI/desarrollo como punto de entrada con matiz. ✅ 3/3. Carlos: PR/CI con Liquibase; Jos: dev/staging; Raúl: dual (CI + monitor proactivo). Implicación: PgPilot necesita múltiples superficies (editor + GitHub Action + monitor de workload).</w:t>
+              <w:t>3. CI/desarrollo como punto de entrada con matiz. ✅ 3/3. Carlos: PR/CI con Liquibase; Jos: dev/staging; Raúl articula dos productos distintos — análisis de arquitectura (fase de diseño de la BD) y análisis de performance en tiempo real (cualquier momento del ciclo, desde staging temprano hasta producción para mantenimiento). Implicación: PgPilot necesita múltiples superficies (editor + GitHub Action + monitor de workload).</w:t>
             </w:r>
           </w:p>
           <w:p/>
           <w:p>
             <w:r>
-              <w:t>4. Privacidad y read-only son bloqueador legal. ✅ 3/3 con escalada por sector. Carlos: read-only; Jos: no logs, control por tabla; Raúl: self-hosted on-premise para fintech. Implicación: modo offline + tier Enterprise self-hosted abren el sector regulado LATAM.</w:t>
+              <w:t>4. Privacidad y read-only son bloqueador legal. ✅ 3/3 con escalada por sector. Carlos: read-only; Jos: no logs, control por tabla; Raúl: conexión punto a punto segura, read-only indiscutible, datos efímeros, distingue explícitamente terceros vs on-premise. Implicación: modo offline + tier Enterprise self-hosted abren el sector regulado LATAM.</w:t>
             </w:r>
           </w:p>
           <w:p/>
           <w:p>
             <w:r>
-              <w:t>5. Decisor heterogéneo — 'es el CTO' matizada. ⚠️ Parcial. Carlos: CTO; Jos: dual técnico + gerencial; Raúl: él mismo aprueba hasta $500/mes ('yo la compraría sin pensarlo'). Implicación: Pro/Team con sales bottom-up a tech leads; Enterprise top-down al CTO.</w:t>
+              <w:lastRenderedPageBreak/>
+              <w:t>5. Decisor heterogéneo — "es el CTO" matizada. ⚠️ Parcial. Carlos: CTO; Jos: dual técnico + gerencial (líder de infra + gerente); Raúl: el equipo técnico impulsa la necesidad, el CTO/directivo toma la decisión final. Implicación: Pro/Team con sales bottom-up al equipo técnico como impulsor + cierre con CTO/gerencia en empresas con proceso formal; Enterprise top-down al CTO.</w:t>
             </w:r>
           </w:p>
           <w:p/>
           <w:p>
             <w:r>
-              <w:t>6. No usan herramientas especializadas. ✅ 3/3. Ninguno usa pganalyze / EverSQL / DBtune. Raúl tiene Grafana + Datadog pero las queries siguen manuales. Implicación: PgPilot compite con 'hacerlo a mano' en LATAM, no con pganalyze.</w:t>
+              <w:t>6. No usan herramientas especializadas. ✅ 3/3. Ninguno usa pganalyze / EverSQL / DBtune. Raúl usa DBeaver Enterprise + pg_stat_statements + EXPLAIN ANALYZE (herramientas nativas, no SaaS). Implicación: PgPilot compite con "hacerlo a mano" en LATAM, no con pganalyze.</w:t>
             </w:r>
           </w:p>
           <w:p/>
           <w:p>
             <w:r>
-              <w:t>7. WTP $29 Pro / $200 BD validado en el sector con más dolor. ✅ 1/3 explícito + 2/3 sin objeción. Raúl validó 'sin pensarlo'. Implicación: mantener Pro $29 y Team $49; plan B '$19' queda como contingencia.</w:t>
+              <w:t>7. Modelo de licencia per-BD cuestionado por escala enterprise. ⚠️ 1/3 cuestiona, 2/3 sin objeción. Raúl (15-20 BDs activas, la mayor ~3 TB) cuestionó si el pricing por BD es el correcto a esa escala y sugirió explorar modelos por usuarios o por tiempo de ejecución. Carlos y Jos no objetaron el rango $50-200/BD. Implicación: mantener el modelo per-seat Pro $29 / Team $49 como principal; evaluar add-on por flota de BDs o tier por tiempo de ejecución para cuentas Enterprise con 15+ BDs; plan B "$19" queda como contingencia.</w:t>
             </w:r>
           </w:p>
           <w:p/>
           <w:p>
             <w:r>
-              <w:t>8. Dolor escala con ausencia de DBA, no con tamaño puro de BD. ⚠️ Hipótesis matizada. Jos (1 GB sin DBA) = 10 h/mes &gt; Carlos (30 GB con equipo) = 1 h/mes. Implicación: ICP correcto es '5-20 devs sin DBA', no '≥100 GB'.</w:t>
+              <w:t>8. Dolor escala con ausencia de DBA, no con tamaño puro de BD. ⚠️ Hipótesis matizada. Jos (1 GB sin DBA) = 10 h/mes &gt; Carlos (30 GB con equipo) = 1 h/mes. Raúl agrega la fase del ciclo de vida como segunda dimensión (3-4 h/mes en prod vs 16-20 h/mes en dev). Implicación: ICP correcto es "5-20 devs sin DBA dedicado, en fase de crecimiento", no "≥100 GB".</w:t>
             </w:r>
           </w:p>
           <w:p/>
           <w:p>
             <w:r>
-              <w:t>9. Monitor proactivo de degradación como 2º caso de uso. 🟢 Oportunidad nueva (Raúl). 'Que revise queries existentes y avise cuáles se pueden optimizar'. Implicación: feature Q3/Q4 sobre pg_stat_statements con tracking histórico + alertas.</w:t>
+              <w:t>9. Monitor proactivo de degradación como 2º caso de uso. 🟢 Oportunidad nueva (Raúl). Articuló dos productos distintos: análisis de arquitectura (diseño/staging) y monitoreo de performance en tiempo real ("que conforme crezca la información me diga qué está fallando"). Implicación: feature Q3/Q4 sobre pg_stat_statements con tracking histórico + alertas.</w:t>
             </w:r>
           </w:p>
           <w:p/>
           <w:p>
             <w:r>
-              <w:t>Hipótesis resueltas / abiertas: WTP $29 ✅ (Raúl); 'dolor crece con tamaño' ⚠️ matizada (DBA-ausencia es el predictor real); modo offline sin LLM 🟡 parcial (Raúl pide self-hosted; R5 explícito no preguntado — confirmar en pilotos).</w:t>
+              <w:t>Hipótesis resueltas / abiertas: WTP $29 🟡 sin objeción de Carlos y Jos, pero Raúl cuestionó el modelo per-BD para flotas grandes — falta validación con paying customers; "dolor crece con tamaño" ⚠️ matizada (DBA-ausencia y fase del ciclo de vida son los predictores reales); modo offline sin LLM 🟡 parcial (Raúl pide tratamiento efímero y prefiere on-premise; R5 explícito no preguntado — confirmar en pilotos).</w:t>
             </w:r>
           </w:p>
           <w:p/>
@@ -1720,17 +1720,17 @@
           </w:p>
           <w:p>
             <w:r>
-              <w:t xml:space="preserve">  · Pricing: mantener Pro $29 y Team $49; plan B '$19' como contingencia.</w:t>
-            </w:r>
-          </w:p>
-          <w:p>
-            <w:r>
-              <w:t xml:space="preserve">  · GTM: Pro/Team bottom-up a tech leads (autonomía hasta ~$500/mes); Enterprise top-down a CTO + finanzas.</w:t>
-            </w:r>
-          </w:p>
-          <w:p>
-            <w:r>
-              <w:t xml:space="preserve">  · Messaging: #1 'Read-only + sanitización fuerte'; #2 'Self-hosted para fintech'; #3 'Detecta los anti-patterns que ya te dolieron — D9/D16/D19 con casos reales'.</w:t>
+              <w:t xml:space="preserve">  · Pricing: mantener per-seat Pro $29 y Team $49 como modelo principal; evaluar add-on por flota de BDs o tier por tiempo de ejecución para Enterprise con 15+ BDs (señal de Raúl); plan B "$19" como contingencia.</w:t>
+            </w:r>
+          </w:p>
+          <w:p>
+            <w:r>
+              <w:t xml:space="preserve">  · GTM: Pro/Team bottom-up con el equipo técnico como impulsor + aprobación de gerente/CTO en empresas con proceso formal (señal consistente Carlos/Jos/Raúl); Enterprise top-down a CTO + finanzas.</w:t>
+            </w:r>
+          </w:p>
+          <w:p>
+            <w:r>
+              <w:t xml:space="preserve">  · Messaging: #1 "Read-only + sanitización fuerte + tratamiento efímero"; #2 "Self-hosted disponible para sectores regulados"; #3 "Detecta los anti-patterns que ya te dolieron — D9/D16 con casos reales + detección proactiva de tablas sin particiones como roadmap".</w:t>
             </w:r>
           </w:p>
         </w:tc>
@@ -2129,7 +2129,6 @@
           </w:tcPr>
           <w:p>
             <w:r>
-              <w:lastRenderedPageBreak/>
               <w:t>Sanitización fuerte de literales pre-LLM + modo 'LLM apagado' con plantillas</w:t>
             </w:r>
           </w:p>
@@ -2274,6 +2273,7 @@
           </w:tcPr>
           <w:p>
             <w:r>
+              <w:lastRenderedPageBreak/>
               <w:t>Característica</w:t>
             </w:r>
           </w:p>
@@ -3267,7 +3267,6 @@
           </w:tcPr>
           <w:p>
             <w:r>
-              <w:lastRenderedPageBreak/>
               <w:t>PgPilot NO es mejor en todo:</w:t>
             </w:r>
           </w:p>
@@ -3349,6 +3348,7 @@
           </w:tcPr>
           <w:p>
             <w:r>
+              <w:lastRenderedPageBreak/>
               <w:t>Nuestro nicho: developers backend LATAM con Postgres en producción en empresas medianas (5-50 devs) en sectores regulados (fintech, healthtech, govtech), que no pueden pagar pganalyze ni mandar SQL con datos a ChatGPT.</w:t>
             </w:r>
           </w:p>
@@ -3541,7 +3541,6 @@
                 <w:sz w:val="20"/>
                 <w:szCs w:val="20"/>
               </w:rPr>
-              <w:lastRenderedPageBreak/>
               <w:t>Tier</w:t>
             </w:r>
           </w:p>
@@ -3954,6 +3953,7 @@
           </w:tcPr>
           <w:p>
             <w:r>
+              <w:lastRenderedPageBreak/>
               <w:t>Enterprise</w:t>
             </w:r>
           </w:p>
@@ -4104,11 +4104,7 @@
           <w:p/>
           <w:p>
             <w:r>
-              <w:t xml:space="preserve">Validación pendiente / hecha. Los precios no se han probado con paying customers (la prueba real es post-Demo Day). De las 3 entrevistas: Raúl (F8, tech lead fintech) validó explícitamente el rango — '200 dólares contra lo que me pagan por esas horas es nada, yo la compraría sin pensarlo' — y declaró autonomía de compra hasta $500/mes sin necesidad de CTO. Carlos (F6) y Jos (F7) no expresaron objeción al rango $50-200/BD. </w:t>
-            </w:r>
-            <w:r>
-              <w:lastRenderedPageBreak/>
-              <w:t>Conclusión: se mantiene Pro $29 y Team $49. El plan B '$19' queda como contingencia para casos sin autonomía de compra del dev.</w:t>
+              <w:t>Validación pendiente / hecha. Los precios no se han probado con paying customers (la prueba real es post-Demo Day). De las 3 entrevistas: Raúl (F8, desarrollador fullstack con 15-20 BDs activas y la mayor ~3 TB) cuestionó el modelo per-BD a su escala y sugirió explorar pricing por usuarios o por tiempo de ejecución. Carlos (F6) y Jos (F7) no expresaron objeción al rango $50-200/BD aunque no se les preguntó precio per-dev exacto. Conclusión: se mantiene Pro $29 y Team $49 per-seat como modelo principal; se evalúa add-on por flota de BDs o tier por tiempo de ejecución para cuentas Enterprise con 15+ BDs (señal de Raúl). El plan B "$19" documentado en pricing.md §6 queda como contingencia para casos donde el dev no tenga autonomía de compra y dependa 100% del CTO con presupuesto en pesos.</w:t>
             </w:r>
           </w:p>
         </w:tc>
@@ -4119,7 +4115,6 @@
         <w:pStyle w:val="Ttulo1"/>
       </w:pPr>
       <w:r>
-        <w:lastRenderedPageBreak/>
         <w:t>7. Tamaño de mercado</w:t>
       </w:r>
     </w:p>
@@ -4180,7 +4175,11 @@
           <w:p/>
           <w:p>
             <w:r>
-              <w:t>Cálculo. Partiendo del mercado DBMS global de $137 B USD en 2025 (Gartner 2025 Forecast Update), aplicamos dos recortes sucesivos: (1) Postgres-only ~15-20% del gasto DBMS (Postgres tiene 55.6% adopción developer per Stack Overflow 2025; ese share se traduce más conservadoramente en gasto enterprise). (2) Subset performance/optimization ~2-5% del gasto DBMS (mercado de database performance management estimado en $4-6 B globales por Mordor / Grand View Research).</w:t>
+              <w:t xml:space="preserve">Cálculo. Partiendo del mercado DBMS global de $137 B USD en 2025 (Gartner 2025 Forecast Update), aplicamos dos recortes sucesivos: (1) Postgres-only ~15-20% del gasto DBMS (Postgres tiene 55.6% adopción developer per Stack Overflow 2025; ese share se traduce más conservadoramente en gasto enterprise). (2) Subset performance/optimization </w:t>
+            </w:r>
+            <w:r>
+              <w:lastRenderedPageBreak/>
+              <w:t>~2-5% del gasto DBMS (mercado de database performance management estimado en $4-6 B globales por Mordor / Grand View Research).</w:t>
             </w:r>
           </w:p>
           <w:p/>
@@ -4203,6 +4202,7 @@
         <w:pStyle w:val="Ttulo2"/>
       </w:pPr>
       <w:r>
+        <w:lastRenderedPageBreak/>
         <w:t>7.2 SAM</w:t>
       </w:r>
     </w:p>
@@ -4318,7 +4318,6 @@
           </w:tcPr>
           <w:p>
             <w:r>
-              <w:lastRenderedPageBreak/>
               <w:t>Definición a 4 años. Lo que PgPilot puede capturar entre mayo 2026 y mayo 2030, dado un equipo fundador pequeño y crecimiento por content + founder-led sales.</w:t>
             </w:r>
           </w:p>
@@ -4403,6 +4402,7 @@
           </w:tcPr>
           <w:p>
             <w:r>
+              <w:lastRenderedPageBreak/>
               <w:t>Por qué el mercado es atractivo AHORA:</w:t>
             </w:r>
           </w:p>
@@ -4518,7 +4518,6 @@
           </w:p>
           <w:p>
             <w:r>
-              <w:lastRenderedPageBreak/>
               <w:t>Mes 7-9: Finnosummit MX / Fintech Week (fintech LATAM, encaje fuerte por privacidad). Sponsor + demos + 1 charla intentada. Objetivo acumulado: 5-7 clientes.</w:t>
             </w:r>
           </w:p>
@@ -4553,7 +4552,6 @@
         <w:pStyle w:val="Ttulo2"/>
       </w:pPr>
       <w:r>
-        <w:lastRenderedPageBreak/>
         <w:t>8.2 Estrategia de growth (después de los 10)</w:t>
       </w:r>
     </w:p>
@@ -4600,6 +4598,7 @@
           </w:tcPr>
           <w:p>
             <w:r>
+              <w:lastRenderedPageBreak/>
               <w:t>Con 10 clientes y ~$80 K ARR (cierre mes 12): (1) inbound dominante (catálogo SEO + casos de estudio + referidos); (2) primer hire AE LATAM mes 13 con quota $200 K ARR, salario $25-30 K + comisión; (3) partner program con consultoras LATAM (margen 25%); (4) expansión a España (mismo idioma, NO US todavía — competiría con pganalyze).</w:t>
             </w:r>
           </w:p>
@@ -4664,39 +4663,19 @@
           <w:p>
             <w:r>
               <w:rPr>
-                <w:b w:val="0"/>
                 <w:i/>
               </w:rPr>
-              <w:t xml:space="preserve">La pregunta de oro: si el competidor más fuerte les copia el feature mañana, ¿por qué los clientes seguirían con ustedes? Análisis completo en </w:t>
-            </w:r>
-            <w:r>
-              <w:rPr>
-                <w:b w:val="0"/>
-                <w:i/>
-              </w:rPr>
-              <w:t>business/diferenciador.md</w:t>
-            </w:r>
-            <w:r>
-              <w:rPr>
-                <w:b w:val="0"/>
-                <w:i/>
-              </w:rPr>
-              <w:t xml:space="preserve"> (F14).</w:t>
+              <w:t>La pregunta de oro: si el competidor más fuerte les copia el feature mañana, ¿por qué los clientes seguirían con ustedes? Análisis completo en business/diferenciador.md (F14).</w:t>
             </w:r>
           </w:p>
           <w:p>
             <w:r>
               <w:rPr>
                 <w:b/>
-                <w:i w:val="0"/>
               </w:rPr>
               <w:t xml:space="preserve">El competidor verdadero no es pganalyze, es ChatGPT genérico gratis. </w:t>
             </w:r>
             <w:r>
-              <w:rPr>
-                <w:b w:val="0"/>
-                <w:i w:val="0"/>
-              </w:rPr>
               <w:t>Esa es la baseline real del developer que evalúa el producto.</w:t>
             </w:r>
           </w:p>
@@ -4704,7 +4683,6 @@
             <w:r>
               <w:rPr>
                 <w:b/>
-                <w:i w:val="0"/>
               </w:rPr>
               <w:t>Nuestro diferenciador es la integridad arquitectónica de cuatro defensores combinados:</w:t>
             </w:r>
@@ -4713,15 +4691,10 @@
             <w:r>
               <w:rPr>
                 <w:b/>
-                <w:i w:val="0"/>
               </w:rPr>
               <w:t xml:space="preserve">1. Motor determinístico que decide, LLM que solo explica. </w:t>
             </w:r>
             <w:r>
-              <w:rPr>
-                <w:b w:val="0"/>
-                <w:i w:val="0"/>
-              </w:rPr>
               <w:t>Las decisiones de detección viven en código Python testeable (/motor/detectors/). El LLM se invoca después de que el motor ya decidió, y solo para prosa pedagógica. Si el LLM contradice al motor, gana el motor (regla R1).</w:t>
             </w:r>
           </w:p>
@@ -4735,7 +4708,6 @@
             </w:r>
             <w:r>
               <w:rPr>
-                <w:b w:val="0"/>
                 <w:i/>
               </w:rPr>
               <w:t>Cambiar a este shape requiere reescribir la pipeline central de un competidor que hoy delega decisión al LLM (EverSQL). 6-12 meses de proyecto para una empresa establecida. Una vez que entrenaste a tus clientes en 'la herramienta puede alucinar', revertir esa percepción cuesta más que rehacer el producto.</w:t>
@@ -4745,15 +4717,10 @@
             <w:r>
               <w:rPr>
                 <w:b/>
-                <w:i w:val="0"/>
               </w:rPr>
               <w:t xml:space="preserve">2. Sanitización fuerte de literales antes del LLM. </w:t>
             </w:r>
             <w:r>
-              <w:rPr>
-                <w:b w:val="0"/>
-                <w:i w:val="0"/>
-              </w:rPr>
               <w:t>ia/sanitizer.py reemplaza strings, números, fechas, UUIDs y emails con placeholders antes de cualquier llamada al LLM. Tests verifican con grep que ningún dato sensible aparece.</w:t>
             </w:r>
           </w:p>
@@ -4767,7 +4734,6 @@
             </w:r>
             <w:r>
               <w:rPr>
-                <w:b w:val="0"/>
                 <w:i/>
               </w:rPr>
               <w:t>Implementarlo serio requiere parser SQL (sqlglot), no regex, y mantenerlo por versión de Postgres. Más importante: ChatGPT y Cursor mandan todo el contexto a su proveedor. Para empresas con LGPD/LFPDPPP/HIPAA, esa diferencia es bloqueador legal. PgPilot ofrece un camino auditable: el sanitizer es código del producto, no una promesa de proveedor.</w:t>
@@ -4777,15 +4743,10 @@
             <w:r>
               <w:rPr>
                 <w:b/>
-                <w:i w:val="0"/>
               </w:rPr>
               <w:t xml:space="preserve">3. Validación en sandbox efímero antes de mostrar. </w:t>
             </w:r>
             <w:r>
-              <w:rPr>
-                <w:b w:val="0"/>
-                <w:i w:val="0"/>
-              </w:rPr>
               <w:t>Cada recomendación pasa por un segundo Postgres efímero donde se aplica el CREATE INDEX propuesto y se compara EXPLAIN antes/después. Si el planner no usa el índice o el costo no baja, la recomendación se descarta. R6 prohíbe copiar datos: el sandbox monta schema con stats falseadas.</w:t>
             </w:r>
           </w:p>
@@ -4799,7 +4760,6 @@
             </w:r>
             <w:r>
               <w:rPr>
-                <w:b w:val="0"/>
                 <w:i/>
               </w:rPr>
               <w:t>pganalyze tiene 'What If?' pero corre en producción del cliente. Falsear stats sin copiar datos es una decisión arquitectónica fuerte. ChatGPT no puede validar nada — su output es texto. Esa es la diferencia entre 'sugerencia plausible' y 'sugerencia verificada'.</w:t>
@@ -4809,15 +4769,10 @@
             <w:r>
               <w:rPr>
                 <w:b/>
-                <w:i w:val="0"/>
               </w:rPr>
               <w:t xml:space="preserve">4. Modo offline / bundle JSON. </w:t>
             </w:r>
             <w:r>
-              <w:rPr>
-                <w:b w:val="0"/>
-                <w:i w:val="0"/>
-              </w:rPr>
               <w:t>El módulo /conector opera contra un bundle JSON exportado por el cliente sin conexión a la BD productiva. Nunca tocamos su BD en ese modo.</w:t>
             </w:r>
           </w:p>
@@ -4831,7 +4786,6 @@
             </w:r>
             <w:r>
               <w:rPr>
-                <w:b w:val="0"/>
                 <w:i/>
               </w:rPr>
               <w:t>Requiere desacoplar el motor del extractor de stats — si el competidor diseñó su producto asumiendo 'siempre hay una conexión viva', refactorizar es trabajo de meses. Es argumento de venta literal: fintech mexicana mediana no firma SOC2 con un SaaS extranjero que pide credenciales de su Postgres productivo.</w:t>
@@ -4841,31 +4795,25 @@
             <w:r>
               <w:rPr>
                 <w:b/>
-                <w:i w:val="0"/>
               </w:rPr>
               <w:t xml:space="preserve">Defensor comercial transversal (foco LATAM). </w:t>
             </w:r>
             <w:r>
-              <w:rPr>
-                <w:b w:val="0"/>
-                <w:i w:val="0"/>
-              </w:rPr>
-              <w:t>No es arquitectónico — es de posicionamiento — pero es real: producto, docs, catálogo de patterns, soporte y onboarding en español (pganalyze tiene 0 contenido en español); soporte en horario hábil LATAM (CST/CDT/BRT vs delay 12-24 h de pganalyze en EST/PST); founders entienden el ciclo de procurement de una fintech mexicana, los topes de presupuesto, las restricciones cambiarias y los stacks dominantes (Node+Postgres / Spring+Postgres); network en comunidades LATAM (Postgres MX, Devs México, FrontendCafé) que una sales motion fría desde San Francisco no compite.</w:t>
+              <w:t xml:space="preserve">No es arquitectónico — es de posicionamiento — pero es real: producto, docs, catálogo de patterns, soporte y </w:t>
+            </w:r>
+            <w:r>
+              <w:lastRenderedPageBreak/>
+              <w:t>onboarding en español (pganalyze tiene 0 contenido en español); soporte en horario hábil LATAM (CST/CDT/BRT vs delay 12-24 h de pganalyze en EST/PST); founders entienden el ciclo de procurement de una fintech mexicana, los topes de presupuesto, las restricciones cambiarias y los stacks dominantes (Node+Postgres / Spring+Postgres); network en comunidades LATAM (Postgres MX, Devs México, FrontendCafé) que una sales motion fría desde San Francisco no compite.</w:t>
             </w:r>
           </w:p>
           <w:p>
             <w:r>
               <w:rPr>
                 <w:b/>
-                <w:i w:val="0"/>
               </w:rPr>
               <w:t xml:space="preserve">Trade-off honesto. </w:t>
             </w:r>
             <w:r>
-              <w:rPr>
-                <w:b w:val="0"/>
-                <w:i w:val="0"/>
-              </w:rPr>
               <w:t>El foco LATAM se erosiona si pganalyze decide entrar a LATAM en serio (contratar Country Manager LATAM en 2027 podría replicar idioma + horario en 6 meses). Cuando eso pase, la defensa baja a los cuatro arquitectónicos — que es lo que se diseñó para resistir esa presión.</w:t>
             </w:r>
           </w:p>
@@ -4873,15 +4821,10 @@
             <w:r>
               <w:rPr>
                 <w:b/>
-                <w:i w:val="0"/>
               </w:rPr>
               <w:t xml:space="preserve">Por qué la combinación es la defensa, no las piezas. </w:t>
             </w:r>
             <w:r>
-              <w:rPr>
-                <w:b w:val="0"/>
-                <w:i w:val="0"/>
-              </w:rPr>
               <w:t>Ninguno de los cuatro defensores es único de PgPilot por separado. Lo único difícil es combinar los cuatro con la misma integridad arquitectónica, porque cada uno restringe el diseño de los otros (sanitización fuerte empuja al motor determinístico; motor determinístico empuja al sandbox; sandbox sin copiar datos empuja al modo offline). Replicar una pieza es fácil; replicar el sistema entero exige rehacer el producto, y un competidor establecido prefiere no romper su producto que ya funciona.</w:t>
             </w:r>
           </w:p>
@@ -4893,6 +4836,7 @@
         <w:pStyle w:val="Ttulo1"/>
       </w:pPr>
       <w:r>
+        <w:lastRenderedPageBreak/>
         <w:t>10. Por qué nuestro equipo</w:t>
       </w:r>
     </w:p>
@@ -4939,38 +4883,24 @@
           </w:tcPr>
           <w:p>
             <w:r>
+              <w:t xml:space="preserve">Equipo de 6 estudiantes de Ingeniería en Sistemas Computacionales, Universidad Anáhuac Querétaro, materia SIS2404 — Bases de Datos Avanzadas. Construimos PgPilot durante un semestre con metodología disciplinada: motor determinístico revisado por humanos, capa de IA encapsulada con guardrails (sanitización + cross-validation + fallback a plantillas), decisiones de arquitectura tomadas por el equipo con bitácora versionada en </w:t>
+            </w:r>
+            <w:r>
               <w:rPr>
-                <w:b w:val="0"/>
-                <w:i w:val="0"/>
-              </w:rPr>
-              <w:t xml:space="preserve">Equipo de 6 estudiantes de Ingeniería en Sistemas Computacionales, Universidad Anáhuac Querétaro, materia SIS2404 — Bases de Datos Avanzadas. Construimos PgPilot durante un semestre con metodología disciplinada: motor determinístico revisado por humanos, capa de IA encapsulada con guardrails (sanitización + cross-validation + fallback a plantillas), decisiones de arquitectura tomadas por el equipo con bitácora versionada en </w:t>
-            </w:r>
-            <w:r>
-              <w:rPr>
-                <w:b w:val="0"/>
                 <w:i/>
               </w:rPr>
               <w:t>docs/decisiones.md</w:t>
             </w:r>
             <w:r>
+              <w:t xml:space="preserve"> y </w:t>
+            </w:r>
+            <w:r>
               <w:rPr>
-                <w:b w:val="0"/>
-                <w:i w:val="0"/>
-              </w:rPr>
-              <w:t xml:space="preserve"> y </w:t>
-            </w:r>
-            <w:r>
-              <w:rPr>
-                <w:b w:val="0"/>
                 <w:i/>
               </w:rPr>
               <w:t>PROGRESS.md</w:t>
             </w:r>
             <w:r>
-              <w:rPr>
-                <w:b w:val="0"/>
-                <w:i w:val="0"/>
-              </w:rPr>
               <w:t>.</w:t>
             </w:r>
           </w:p>
@@ -4978,29 +4908,19 @@
             <w:r>
               <w:rPr>
                 <w:b/>
-                <w:i w:val="0"/>
               </w:rPr>
               <w:t xml:space="preserve">Integrantes y reparto técnico real </w:t>
             </w:r>
             <w:r>
+              <w:t xml:space="preserve">(basado en autores de los commits en </w:t>
+            </w:r>
+            <w:r>
               <w:rPr>
-                <w:b w:val="0"/>
-                <w:i w:val="0"/>
-              </w:rPr>
-              <w:t xml:space="preserve">(basado en autores de los commits en </w:t>
-            </w:r>
-            <w:r>
-              <w:rPr>
-                <w:b w:val="0"/>
                 <w:i/>
               </w:rPr>
               <w:t>git shortlog -sn</w:t>
             </w:r>
             <w:r>
-              <w:rPr>
-                <w:b w:val="0"/>
-                <w:i w:val="0"/>
-              </w:rPr>
               <w:t>):</w:t>
             </w:r>
           </w:p>
@@ -5018,7 +4938,7 @@
               <w:t xml:space="preserve">Backend + orquestador + infraestructura. </w:t>
             </w:r>
             <w:r>
-              <w:t xml:space="preserve">Repo y estructura, Docker Compose (AppDB :5434 + sandbox :5435), pool read-only con timeout, extractor de schema vía pg_catalog y de tamaños de tabla con categorización, parser EXPLAIN JSON con PlanNode (16+ tipos de nodo), helper find_nodes (DFS pre-order), detectores D2 (Nested Loop con outer grande), D9 (SELECT *), D20 (índice cubriente) y D22 (count(*) sin WHERE), recomendador con filtro de selectividad (umbral 20%), validador en sandbox por cambio de tipo de nodo (Seq Scan → Index Scan), scaffold frontend (Vite + React + Monaco), backend FastAPI /analyze, wiring backend↔frontend (B14), scripts de medición empírica de cobertura.</w:t>
+              <w:t>Repo y estructura, Docker Compose (AppDB :5434 + sandbox :5435), pool read-only con timeout, extractor de schema vía pg_catalog y de tamaños de tabla con categorización, parser EXPLAIN JSON con PlanNode (16+ tipos de nodo), helper find_nodes (DFS pre-order), detectores D2 (Nested Loop con outer grande), D9 (SELECT *), D20 (índice cubriente) y D22 (count(*) sin WHERE), recomendador con filtro de selectividad (umbral 20%), validador en sandbox por cambio de tipo de nodo (Seq Scan → Index Scan), scaffold frontend (Vite + React + Monaco), backend FastAPI /analyze, wiring backend↔frontend (B14), scripts de medición empírica de cobertura.</w:t>
             </w:r>
           </w:p>
           <w:p>
@@ -5035,52 +4955,44 @@
               <w:t xml:space="preserve">Conector + sandbox + negocio. </w:t>
             </w:r>
             <w:r>
-              <w:t xml:space="preserve">Extractor de stats por columna (pg_stats con n_distinct, null_frac, most_common_vals, correlation), cache de metadata con fingerprint MD5 y detección de drift por content hash, modo offline con bundle JSON portable (export_bundle/load_bundle/validate_bundle), sandbox Postgres efímero con pg_restore_relation_stats (PG18+), pool de sandbox separado, orquestación explain_in_sandbox con cleanup try/finally. Investigación competitiva (F3, 4 competidores), modelo de pricing per-seat 4 tiers (F11), TAM/SAM/SOM con metodología razonada (F12, $800M / $34M / $850K), plan go-to-market founder-led + content-driven (F13, Show HN + Nerdearla + Finnosummit), diferenciador defendible (F14) con marco 'el competidor real es ChatGPT', documento de negocio consolidado (F15, .docx preservando plantilla del profesor).</w:t>
+              <w:t>Extractor de stats por columna (pg_stats con n_distinct, null_frac, most_common_vals, correlation), cache de metadata con fingerprint MD5 y detección de drift por content hash, modo offline con bundle JSON portable (export_bundle/load_bundle/validate_bundle), sandbox Postgres efímero con pg_restore_relation_stats (PG18+), pool de sandbox separado, orquestación explain_in_sandbox con cleanup try/finally. Investigación competitiva (F3, 4 competidores), modelo de pricing per-seat 4 tiers (F11), TAM/SAM/SOM con metodología razonada (F12, $800M / $34M / $850K), plan go-to-market founder-led + content-driven (F13, Show HN + Nerdearla + Finnosummit), diferenciador defendible (F14) con marco 'el competidor real es ChatGPT', documento de negocio consolidado (F15, .docx preservando plantilla del profesor).</w:t>
             </w:r>
           </w:p>
           <w:p>
             <w:r>
               <w:rPr>
                 <w:b/>
-                <w:i w:val="0"/>
               </w:rPr>
               <w:t xml:space="preserve">Diego Núñez (matrícula 00516279) — </w:t>
             </w:r>
             <w:r>
               <w:rPr>
-                <w:b w:val="0"/>
                 <w:i/>
               </w:rPr>
               <w:t xml:space="preserve">Detectores estructurales + workload. </w:t>
             </w:r>
             <w:r>
-              <w:rPr>
-                <w:b w:val="0"/>
-                <w:i w:val="0"/>
-              </w:rPr>
-              <w:t>Detectores D3 (LIKE wildcard inicio), D4 (función no-immutable), D5 (OR cruzando tablas), D7 (subquery correlacionada). Parser pg_stat_statements con heurística JSON/CSV, scoring por total_exec_time, endpoint POST /workload con multipart, tab Workload Analysis en frontend, cleanup de schemas zombies, timeouts duros en sandbox, fix del orquestador /analyze para que los 18 detectores corran. Lista de candidatos a entrevistar (F4) y guion de 9 preguntas (F5).</w:t>
+              <w:t xml:space="preserve">Detectores D3 (LIKE wildcard inicio), D4 (función no-immutable), D5 (OR cruzando tablas), D7 (subquery </w:t>
+            </w:r>
+            <w:r>
+              <w:lastRenderedPageBreak/>
+              <w:t>correlacionada). Parser pg_stat_statements con heurística JSON/CSV, scoring por total_exec_time, endpoint POST /workload con multipart, tab Workload Analysis en frontend, cleanup de schemas zombies, timeouts duros en sandbox, fix del orquestador /analyze para que los 18 detectores corran. Lista de candidatos a entrevistar (F4) y guion de 9 preguntas (F5).</w:t>
             </w:r>
           </w:p>
           <w:p>
             <w:r>
               <w:rPr>
                 <w:b/>
-                <w:i w:val="0"/>
               </w:rPr>
               <w:t xml:space="preserve">Regina Valenzuela (matrícula 00508321) — </w:t>
             </w:r>
             <w:r>
               <w:rPr>
-                <w:b w:val="0"/>
                 <w:i/>
               </w:rPr>
               <w:t xml:space="preserve">Capa IA (sanitización) + detectores índices. </w:t>
             </w:r>
             <w:r>
-              <w:rPr>
-                <w:b w:val="0"/>
-                <w:i w:val="0"/>
-              </w:rPr>
               <w:t>Sanitizador de literales con 5 tipos de placeholders ($LITERAL_&lt;tipo&gt;_&lt;i&gt;), test de privacidad con grep externo (email + RFC + tarjeta de prueba). Detectores D16 (índice faltante, el más rentable: 7 queries), D11 (índice parcial bool), D17 (cardinalidad JOIN → CREATE STATISTICS), D19 (NOT IN nullable → bug silencioso). Refactor motor/detectors/_common.py. README bilingüe del repo (macOS + WSL2 + Windows con troubleshooting). Documento de arquitectura consolidado. User persona Andrés Villanueva (F10).</w:t>
             </w:r>
           </w:p>
@@ -5088,22 +5000,16 @@
             <w:r>
               <w:rPr>
                 <w:b/>
-                <w:i w:val="0"/>
               </w:rPr>
               <w:t xml:space="preserve">Emilio Tolosa (matrícula 00520630) — </w:t>
             </w:r>
             <w:r>
               <w:rPr>
-                <w:b w:val="0"/>
                 <w:i/>
               </w:rPr>
               <w:t xml:space="preserve">Documentación externa + validación en frontend. </w:t>
             </w:r>
             <w:r>
-              <w:rPr>
-                <w:b w:val="0"/>
-                <w:i w:val="0"/>
-              </w:rPr>
               <w:t>Docs externas de /conector (garantías read-only contractuales), /motor (pipeline + tabla de los 19 detectores con confianzas verificadas), /ia (system-prompt + Pydantic + cruz-validador + modo 'LLM apagado', crítica para Q&amp;A), /sandbox (R6 'no se copian datos' + tabla 'qué sí/qué no se falsea'). Indicadores de validación R3 en frontend (helper _compute_validations + componente ValidationIndicators con 4 píldoras: schema_ok, no_duplicate_index, syntax_valid, sandbox_improves). Auditoría final del catálogo de 19 patterns. Índice maestro docs/README.md.</w:t>
             </w:r>
           </w:p>
@@ -5111,22 +5017,16 @@
             <w:r>
               <w:rPr>
                 <w:b/>
-                <w:i w:val="0"/>
               </w:rPr>
               <w:t xml:space="preserve">David Ramírez (matrícula 00492597) — </w:t>
             </w:r>
             <w:r>
               <w:rPr>
-                <w:b w:val="0"/>
                 <w:i/>
               </w:rPr>
               <w:t xml:space="preserve">Detectores SQL + capa de validación IA. </w:t>
             </w:r>
             <w:r>
-              <w:rPr>
-                <w:b w:val="0"/>
-                <w:i w:val="0"/>
-              </w:rPr>
               <w:t>Detectores D12 (cast implícito que invalida btree), D14 (CTE materializada innecesaria), D18 (HAVING → WHERE), D8 (IN → EXISTS dual plan+SQL). Capa /ia: validador Pydantic con reintentos (rechazo de JSON malformado, explanation vacío, confidence fuera de rango), cross-validator de identificadores contra schema (descarta índice duplicado, columna inexistente, SQL no parseable), plantillas determinísticas con confianza ajustable por selectividad, orquestador explain_recommendation con fallback a plantilla ante cualquier excepción del LLM (garantiza R5).</w:t>
             </w:r>
           </w:p>
@@ -5134,71 +5034,46 @@
             <w:r>
               <w:rPr>
                 <w:b/>
-                <w:i w:val="0"/>
               </w:rPr>
               <w:t xml:space="preserve">Por qué este equipo es el adecuado: </w:t>
             </w:r>
             <w:r>
-              <w:rPr>
-                <w:b w:val="0"/>
-                <w:i w:val="0"/>
-              </w:rPr>
               <w:t xml:space="preserve">(1) </w:t>
             </w:r>
             <w:r>
               <w:rPr>
                 <w:b/>
-                <w:i w:val="0"/>
               </w:rPr>
               <w:t>conocemos el mercado</w:t>
             </w:r>
             <w:r>
-              <w:rPr>
-                <w:b w:val="0"/>
-                <w:i w:val="0"/>
-              </w:rPr>
               <w:t xml:space="preserve"> — developers LATAM en formación; el persona Andrés Villanueva es una versión adulta de nosotros; (2) </w:t>
             </w:r>
             <w:r>
               <w:rPr>
                 <w:b/>
-                <w:i w:val="0"/>
               </w:rPr>
               <w:t>disciplina arquitectónica demostrada</w:t>
             </w:r>
             <w:r>
-              <w:rPr>
-                <w:b w:val="0"/>
-                <w:i w:val="0"/>
-              </w:rPr>
               <w:t xml:space="preserve"> — la regla R1 ('motor decide, LLM explica, sandbox valida') está codificada en RULES.md y verificada en tests automatizados, no es slide de pitch; (3) </w:t>
             </w:r>
             <w:r>
               <w:rPr>
                 <w:b/>
-                <w:i w:val="0"/>
               </w:rPr>
               <w:t>honestidad declarada</w:t>
             </w:r>
             <w:r>
-              <w:rPr>
-                <w:b w:val="0"/>
-                <w:i w:val="0"/>
-              </w:rPr>
               <w:t xml:space="preserve"> — el documento marca explícitamente qué hipótesis siguen abiertas tras las 3 entrevistas; (4) </w:t>
             </w:r>
             <w:r>
               <w:rPr>
                 <w:b/>
-                <w:i w:val="0"/>
               </w:rPr>
               <w:t>bitácora versionada</w:t>
             </w:r>
             <w:r>
-              <w:rPr>
-                <w:b w:val="0"/>
-                <w:i w:val="0"/>
-              </w:rPr>
               <w:t xml:space="preserve"> — 3,000+ líneas de PROGRESS.md al cierre del semestre, trazabilidad que no se improvisa.</w:t>
             </w:r>
           </w:p>
@@ -5206,15 +5081,10 @@
             <w:r>
               <w:rPr>
                 <w:b/>
-                <w:i w:val="0"/>
               </w:rPr>
               <w:t xml:space="preserve">Sobre el tamaño del equipo (6 personas). </w:t>
             </w:r>
             <w:r>
-              <w:rPr>
-                <w:b w:val="0"/>
-                <w:i w:val="0"/>
-              </w:rPr>
               <w:t>La rúbrica oficial calibra para equipos de 5. Trabajamos como 6 con el conocimiento del profesor: el alumno adicional asumió las áreas de documentación externa y validación en frontend que de otro modo habrían quedado descubiertas. El reparto arriba demuestra contribuciones independientes y simétricas — no hay polizones; cada miembro defiende componentes específicos en el Q&amp;A.</w:t>
             </w:r>
           </w:p>
@@ -5428,7 +5298,11 @@
           </w:tcPr>
           <w:p>
             <w:r>
-              <w:t>GitHub Action CI + monitor de degradación (paso 1) + cobertura AppDB v2 + landing con Stripe/Cal.</w:t>
+              <w:t xml:space="preserve">GitHub Action CI + monitor de degradación (paso 1) + </w:t>
+            </w:r>
+            <w:r>
+              <w:lastRenderedPageBreak/>
+              <w:t>cobertura AppDB v2 + landing con Stripe/Cal.</w:t>
             </w:r>
           </w:p>
         </w:tc>
@@ -5451,7 +5325,12 @@
           </w:tcPr>
           <w:p>
             <w:r>
-              <w:t>Show HN + 15 artículos Dev.to + 50 outreach LATAM. Primer pilot 90 días firmado.</w:t>
+              <w:lastRenderedPageBreak/>
+              <w:t xml:space="preserve">Show HN + 15 artículos Dev.to + 50 outreach </w:t>
+            </w:r>
+            <w:r>
+              <w:lastRenderedPageBreak/>
+              <w:t>LATAM. Primer pilot 90 días firmado.</w:t>
             </w:r>
           </w:p>
         </w:tc>
@@ -5474,7 +5353,12 @@
           </w:tcPr>
           <w:p>
             <w:r>
-              <w:t>Setup operativo (LLC, dominio, staging). Estructura legal.</w:t>
+              <w:lastRenderedPageBreak/>
+              <w:t xml:space="preserve">Setup operativo (LLC, dominio, </w:t>
+            </w:r>
+            <w:r>
+              <w:lastRenderedPageBreak/>
+              <w:t>staging). Estructura legal.</w:t>
             </w:r>
           </w:p>
         </w:tc>
@@ -5502,6 +5386,7 @@
           </w:tcPr>
           <w:p>
             <w:r>
+              <w:lastRenderedPageBreak/>
               <w:t>Q2 (ago-oct 2026)</w:t>
             </w:r>
           </w:p>
@@ -5861,7 +5746,7 @@
       <w:footerReference w:type="default" r:id="rId8"/>
       <w:pgSz w:w="12240" w:h="15840"/>
       <w:pgMar w:top="1700" w:right="1440" w:bottom="1100" w:left="1440" w:header="708" w:footer="708" w:gutter="0"/>
-      <w:pgNumType w:start="12"/>
+      <w:pgNumType w:start="1"/>
       <w:cols w:space="720"/>
       <w:docGrid w:linePitch="360"/>
     </w:sectPr>
@@ -5919,7 +5804,7 @@
         <w:sz w:val="16"/>
         <w:szCs w:val="16"/>
       </w:rPr>
-      <w:instrText>PAGE</w:instrText>
+      <w:instrText>PAGE   \* MERGEFORMAT</w:instrText>
     </w:r>
     <w:r>
       <w:rPr>
@@ -5934,8 +5819,9 @@
         <w:color w:val="565354"/>
         <w:sz w:val="16"/>
         <w:szCs w:val="16"/>
+        <w:lang w:val="es-ES"/>
       </w:rPr>
-      <w:t>19</w:t>
+      <w:t>1</w:t>
     </w:r>
     <w:r>
       <w:rPr>
@@ -5951,7 +5837,15 @@
         <w:sz w:val="16"/>
         <w:szCs w:val="16"/>
       </w:rPr>
-      <w:t xml:space="preserve"> de 19</w:t>
+      <w:t xml:space="preserve"> de </w:t>
+    </w:r>
+    <w:r>
+      <w:rPr>
+        <w:color w:val="565354"/>
+        <w:sz w:val="16"/>
+        <w:szCs w:val="16"/>
+      </w:rPr>
+      <w:t>16</w:t>
     </w:r>
   </w:p>
 </w:ftr>
@@ -6828,6 +6722,48 @@
       <w:szCs w:val="20"/>
     </w:rPr>
   </w:style>
+  <w:style w:type="paragraph" w:styleId="Encabezado">
+    <w:name w:val="header"/>
+    <w:basedOn w:val="Normal"/>
+    <w:link w:val="EncabezadoCar"/>
+    <w:uiPriority w:val="99"/>
+    <w:unhideWhenUsed/>
+    <w:rsid w:val="006A07F1"/>
+    <w:pPr>
+      <w:tabs>
+        <w:tab w:val="center" w:pos="4419"/>
+        <w:tab w:val="right" w:pos="8838"/>
+      </w:tabs>
+    </w:pPr>
+  </w:style>
+  <w:style w:type="character" w:customStyle="1" w:styleId="EncabezadoCar">
+    <w:name w:val="Encabezado Car"/>
+    <w:basedOn w:val="Fuentedeprrafopredeter"/>
+    <w:link w:val="Encabezado"/>
+    <w:uiPriority w:val="99"/>
+    <w:rsid w:val="006A07F1"/>
+  </w:style>
+  <w:style w:type="paragraph" w:styleId="Piedepgina">
+    <w:name w:val="footer"/>
+    <w:basedOn w:val="Normal"/>
+    <w:link w:val="PiedepginaCar"/>
+    <w:uiPriority w:val="99"/>
+    <w:unhideWhenUsed/>
+    <w:rsid w:val="006A07F1"/>
+    <w:pPr>
+      <w:tabs>
+        <w:tab w:val="center" w:pos="4419"/>
+        <w:tab w:val="right" w:pos="8838"/>
+      </w:tabs>
+    </w:pPr>
+  </w:style>
+  <w:style w:type="character" w:customStyle="1" w:styleId="PiedepginaCar">
+    <w:name w:val="Pie de página Car"/>
+    <w:basedOn w:val="Fuentedeprrafopredeter"/>
+    <w:link w:val="Piedepgina"/>
+    <w:uiPriority w:val="99"/>
+    <w:rsid w:val="006A07F1"/>
+  </w:style>
 </w:styles>
 </file>
 

</xml_diff>